<commit_message>
Update Six Sigma rating column to Dat chuan instead of Xuat sac in Excel and Word
</commit_message>
<xml_diff>
--- a/public/Bang_02_Ket_Qua_Sau_Khi_Ap_Dung_De_Tai.docx
+++ b/public/Bang_02_Ket_Qua_Sau_Khi_Ap_Dung_De_Tai.docx
@@ -1188,7 +1188,7 @@
                 <w:color w:val="047857"/>
                 <w:sz w:val="20"/>
               </w:rPr>
-              <w:t>Tốt (Good ≥ 4σ)</w:t>
+              <w:t>Đạt chuẩn</w:t>
             </w:r>
           </w:p>
         </w:tc>
@@ -1452,7 +1452,7 @@
                 <w:color w:val="047857"/>
                 <w:sz w:val="20"/>
               </w:rPr>
-              <w:t>Tốt (Good ≥ 4σ)</w:t>
+              <w:t>Đạt chuẩn</w:t>
             </w:r>
           </w:p>
         </w:tc>
@@ -1742,7 +1742,7 @@
                 <w:color w:val="047857"/>
                 <w:sz w:val="20"/>
               </w:rPr>
-              <w:t>Xuất sắc (≥ 5σ)</w:t>
+              <w:t>Đạt chuẩn</w:t>
             </w:r>
           </w:p>
         </w:tc>
@@ -2006,7 +2006,7 @@
                 <w:color w:val="047857"/>
                 <w:sz w:val="20"/>
               </w:rPr>
-              <w:t>Xuất sắc (≥ 5σ)</w:t>
+              <w:t>Đạt chuẩn</w:t>
             </w:r>
           </w:p>
         </w:tc>
@@ -3167,7 +3167,7 @@
                 <w:color w:val="1E40AF"/>
                 <w:sz w:val="19"/>
               </w:rPr>
-              <w:t>Tăng +2.79σ (Mức Tốt)</w:t>
+              <w:t>Tăng +2.79σ (Đạt chuẩn)</w:t>
             </w:r>
           </w:p>
         </w:tc>
@@ -3427,7 +3427,7 @@
                 <w:color w:val="1E40AF"/>
                 <w:sz w:val="19"/>
               </w:rPr>
-              <w:t>Tăng +2.91σ (Mức Tốt)</w:t>
+              <w:t>Tăng +2.91σ (Đạt chuẩn)</w:t>
             </w:r>
           </w:p>
         </w:tc>
@@ -3713,7 +3713,7 @@
                 <w:color w:val="1E40AF"/>
                 <w:sz w:val="19"/>
               </w:rPr>
-              <w:t>Tăng +4.08σ (Mức Xuất sắc)</w:t>
+              <w:t>Tăng +4.08σ (Đạt chuẩn)</w:t>
             </w:r>
           </w:p>
         </w:tc>
@@ -3973,7 +3973,7 @@
                 <w:color w:val="1E40AF"/>
                 <w:sz w:val="19"/>
               </w:rPr>
-              <w:t>Tăng +4.14σ (Mức Xuất sắc)</w:t>
+              <w:t>Tăng +4.14σ (Đạt chuẩn)</w:t>
             </w:r>
           </w:p>
         </w:tc>
@@ -4012,7 +4012,7 @@
         <w:t>2. Đạt 100% giới hạn sai số toàn bộ cho phép (TEa): Sai số tổng thực tế (TE) giảm từ 10.47% - 16.50% xuống chỉ còn 5.01% - 5.66%, đưa toàn bộ các chỉ số vào vùng kiểm soát nghiêm ngặt theo tiêu chuẩn quốc tế CLSI C24 và Westgard (TE ≤ TEa).</w:t>
         <w:br/>
         <w:br/>
-        <w:t>3. Nâng cấp vượt bậc năng lực Six Sigma: Chỉ số Six Sigma tăng trưởng ngoạn mục từ mức không chấp nhận được (&lt; 2.0σ) lên mức Đạt chuẩn (Glucose đạt &gt; 3.1σ), mức Tốt (Ure đạt &gt; 4.2σ) và mức Xuất sắc (Creatinin đạt &gt; 5.6σ).</w:t>
+        <w:t>3. Nâng cấp vượt bậc năng lực Six Sigma: Chỉ số Six Sigma tăng trưởng rõ rệt từ mức không chấp nhận được (&lt; 2.0σ) lên mức Đạt chuẩn (Glucose đạt &gt; 3.1σ, Ure đạt &gt; 4.2σ và Creatinin đạt &gt; 5.6σ, 100% các xét nghiệm đều đạt chuẩn yêu cầu kiểm soát chất lượng).</w:t>
         <w:br/>
         <w:br/>
         <w:t>4. Tối ưu hóa vận hành &amp; Giảm thiểu chi phí: Nhờ việc chuẩn hóa SD thực tế, quy trình kiểm soát đa quy tắc Westgard vận hành chính xác, loại bỏ hoàn toàn các cảnh báo giả, hạn chế tối đa việc phải chạy lại mẫu vô lý hoặc hiệu chuẩn (Calib) lãng phí hóa chất, đồng thời đảm bảo kết quả trả cho người bệnh có độ tin cậy và chính xác cao nhất."</w:t>

</xml_diff>